<commit_message>
Refactor system prompts and documentation to remove field validation stage
- Updated README and related documentation to reflect the removal of the 'field_validation' stage from the system prompts.
- Adjusted constants and validation scripts to align with the new three-stage pipeline.
- Cleaned up prompt definitions and placeholders to ensure consistency across the application.
</commit_message>
<xml_diff>
--- a/docs/SGB_AILegal_Blueprint_Sprint1.docx
+++ b/docs/SGB_AILegal_Blueprint_Sprint1.docx
@@ -58,7 +58,7 @@
           <w:i/>
           <w:sz w:val="22"/>
         </w:rPr>
-        <w:t>Phiên bản 1.16 — 06/08/2026</w:t>
+        <w:t>Phiên bản 1.18 — 06/08/2026</w:t>
       </w:r>
     </w:p>
     <w:p>
@@ -777,7 +777,7 @@
           <w:rFonts w:ascii="Calibri" w:hAnsi="Calibri"/>
           <w:sz w:val="20"/>
         </w:rPr>
-        <w:t>18</w:t>
+        <w:t>19</w:t>
       </w:r>
     </w:p>
     <w:p>
@@ -985,7 +985,7 @@
           <w:rFonts w:ascii="Calibri" w:hAnsi="Calibri"/>
           <w:sz w:val="20"/>
         </w:rPr>
-        <w:t>24</w:t>
+        <w:t>25</w:t>
       </w:r>
     </w:p>
     <w:p>
@@ -1407,6 +1407,136 @@
     <w:p>
       <w:pPr>
         <w:spacing w:after="40" w:before="0" w:line="276" w:lineRule="auto"/>
+        <w:ind w:left="793"/>
+        <w:tabs>
+          <w:tab w:val="right" w:leader="dot" w:pos="9072"/>
+        </w:tabs>
+      </w:pPr>
+      <w:r>
+        <w:rPr>
+          <w:rFonts w:ascii="Calibri" w:hAnsi="Calibri"/>
+          <w:sz w:val="20"/>
+        </w:rPr>
+        <w:t xml:space="preserve">5.3.3 Nguyên tắc cấu hình System Prompt (cho Dev / IT)</w:t>
+      </w:r>
+      <w:r>
+        <w:tab/>
+      </w:r>
+      <w:r>
+        <w:rPr>
+          <w:rFonts w:ascii="Calibri" w:hAnsi="Calibri"/>
+          <w:sz w:val="20"/>
+        </w:rPr>
+        <w:t>36</w:t>
+      </w:r>
+    </w:p>
+    <w:p>
+      <w:pPr>
+        <w:spacing w:after="40" w:before="0" w:line="276" w:lineRule="auto"/>
+        <w:ind w:left="793"/>
+        <w:tabs>
+          <w:tab w:val="right" w:leader="dot" w:pos="9072"/>
+        </w:tabs>
+      </w:pPr>
+      <w:r>
+        <w:rPr>
+          <w:rFonts w:ascii="Calibri" w:hAnsi="Calibri"/>
+          <w:sz w:val="20"/>
+        </w:rPr>
+        <w:t xml:space="preserve">5.3.4 Stage 1 — Checklist review (first-pass)</w:t>
+      </w:r>
+      <w:r>
+        <w:tab/>
+      </w:r>
+      <w:r>
+        <w:rPr>
+          <w:rFonts w:ascii="Calibri" w:hAnsi="Calibri"/>
+          <w:sz w:val="20"/>
+        </w:rPr>
+        <w:t>37</w:t>
+      </w:r>
+    </w:p>
+    <w:p>
+      <w:pPr>
+        <w:spacing w:after="40" w:before="0" w:line="276" w:lineRule="auto"/>
+        <w:ind w:left="793"/>
+        <w:tabs>
+          <w:tab w:val="right" w:leader="dot" w:pos="9072"/>
+        </w:tabs>
+      </w:pPr>
+      <w:r>
+        <w:rPr>
+          <w:rFonts w:ascii="Calibri" w:hAnsi="Calibri"/>
+          <w:sz w:val="20"/>
+        </w:rPr>
+        <w:t xml:space="preserve">5.3.5 Stage 2 — Chat edit</w:t>
+      </w:r>
+      <w:r>
+        <w:tab/>
+      </w:r>
+      <w:r>
+        <w:rPr>
+          <w:rFonts w:ascii="Calibri" w:hAnsi="Calibri"/>
+          <w:sz w:val="20"/>
+        </w:rPr>
+        <w:t>37</w:t>
+      </w:r>
+    </w:p>
+    <w:p>
+      <w:pPr>
+        <w:spacing w:after="40" w:before="0" w:line="276" w:lineRule="auto"/>
+        <w:ind w:left="793"/>
+        <w:tabs>
+          <w:tab w:val="right" w:leader="dot" w:pos="9072"/>
+        </w:tabs>
+      </w:pPr>
+      <w:r>
+        <w:rPr>
+          <w:rFonts w:ascii="Calibri" w:hAnsi="Calibri"/>
+          <w:sz w:val="20"/>
+        </w:rPr>
+        <w:t xml:space="preserve">5.3.6 Stage 3 — AI summary &amp; fairness</w:t>
+      </w:r>
+      <w:r>
+        <w:tab/>
+      </w:r>
+      <w:r>
+        <w:rPr>
+          <w:rFonts w:ascii="Calibri" w:hAnsi="Calibri"/>
+          <w:sz w:val="20"/>
+        </w:rPr>
+        <w:t>38</w:t>
+      </w:r>
+    </w:p>
+    <w:p>
+      <w:pPr>
+        <w:spacing w:after="40" w:before="0" w:line="276" w:lineRule="auto"/>
+        <w:ind w:left="793"/>
+        <w:tabs>
+          <w:tab w:val="right" w:leader="dot" w:pos="9072"/>
+        </w:tabs>
+      </w:pPr>
+      <w:r>
+        <w:rPr>
+          <w:rFonts w:ascii="Calibri" w:hAnsi="Calibri"/>
+          <w:sz w:val="20"/>
+        </w:rPr>
+        <w:t xml:space="preserve">5.3.7 Luồng gọi 3 stage trong pipeline (Dev)</w:t>
+      </w:r>
+      <w:r>
+        <w:tab/>
+      </w:r>
+      <w:r>
+        <w:rPr>
+          <w:rFonts w:ascii="Calibri" w:hAnsi="Calibri"/>
+          <w:sz w:val="20"/>
+        </w:rPr>
+        <w:t>38</w:t>
+      </w:r>
+    </w:p>
+    <w:p>
+      <w:pPr>
+        <w:spacing w:after="40" w:before="0" w:line="276" w:lineRule="auto"/>
         <w:ind w:left="226"/>
         <w:tabs>
           <w:tab w:val="right" w:leader="dot" w:pos="9072"/>
@@ -1427,7 +1557,7 @@
           <w:rFonts w:ascii="Calibri" w:hAnsi="Calibri"/>
           <w:sz w:val="22"/>
         </w:rPr>
-        <w:t>36</w:t>
+        <w:t>39</w:t>
       </w:r>
     </w:p>
     <w:p>
@@ -1453,7 +1583,7 @@
           <w:rFonts w:ascii="Calibri" w:hAnsi="Calibri"/>
           <w:sz w:val="20"/>
         </w:rPr>
-        <w:t>36</w:t>
+        <w:t>39</w:t>
       </w:r>
     </w:p>
     <w:p>
@@ -1479,7 +1609,7 @@
           <w:rFonts w:ascii="Calibri" w:hAnsi="Calibri"/>
           <w:sz w:val="20"/>
         </w:rPr>
-        <w:t>36</w:t>
+        <w:t>39</w:t>
       </w:r>
     </w:p>
     <w:p>
@@ -1505,7 +1635,7 @@
           <w:rFonts w:ascii="Calibri" w:hAnsi="Calibri"/>
           <w:sz w:val="20"/>
         </w:rPr>
-        <w:t>36</w:t>
+        <w:t>39</w:t>
       </w:r>
     </w:p>
     <w:p>
@@ -1531,7 +1661,7 @@
           <w:rFonts w:ascii="Calibri" w:hAnsi="Calibri"/>
           <w:sz w:val="20"/>
         </w:rPr>
-        <w:t>36</w:t>
+        <w:t>39</w:t>
       </w:r>
     </w:p>
     <w:p>
@@ -1557,7 +1687,7 @@
           <w:rFonts w:ascii="Calibri" w:hAnsi="Calibri"/>
           <w:sz w:val="22"/>
         </w:rPr>
-        <w:t>38</w:t>
+        <w:t>41</w:t>
       </w:r>
     </w:p>
     <w:p>
@@ -1583,7 +1713,7 @@
           <w:rFonts w:ascii="Calibri" w:hAnsi="Calibri"/>
           <w:sz w:val="20"/>
         </w:rPr>
-        <w:t>38</w:t>
+        <w:t>41</w:t>
       </w:r>
     </w:p>
     <w:p>
@@ -1609,7 +1739,7 @@
           <w:rFonts w:ascii="Calibri" w:hAnsi="Calibri"/>
           <w:sz w:val="20"/>
         </w:rPr>
-        <w:t>38</w:t>
+        <w:t>41</w:t>
       </w:r>
     </w:p>
     <w:p>
@@ -1635,7 +1765,7 @@
           <w:rFonts w:ascii="Calibri" w:hAnsi="Calibri"/>
           <w:sz w:val="20"/>
         </w:rPr>
-        <w:t>39</w:t>
+        <w:t>42</w:t>
       </w:r>
     </w:p>
     <w:p>
@@ -1664,7 +1794,7 @@
           <w:b/>
           <w:color w:val="1F4E79"/>
         </w:rPr>
-        <w:t>39</w:t>
+        <w:t>43</w:t>
       </w:r>
     </w:p>
     <w:p>
@@ -1693,7 +1823,7 @@
           <w:b/>
           <w:color w:val="1F4E79"/>
         </w:rPr>
-        <w:t>40</w:t>
+        <w:t>43</w:t>
       </w:r>
     </w:p>
     <w:p>
@@ -2771,6 +2901,122 @@
           </w:p>
         </w:tc>
       </w:tr>
+      <w:tr>
+        <w:tc>
+          <w:tcPr>
+            <w:tcW w:type="dxa" w:w="1417"/>
+          </w:tcPr>
+          <w:p>
+            <w:r/>
+            <w:r>
+              <w:rPr>
+                <w:sz w:val="20"/>
+              </w:rPr>
+              <w:t>1.17</w:t>
+            </w:r>
+          </w:p>
+        </w:tc>
+        <w:tc>
+          <w:tcPr>
+            <w:tcW w:type="dxa" w:w="1701"/>
+          </w:tcPr>
+          <w:p>
+            <w:r/>
+            <w:r>
+              <w:rPr>
+                <w:sz w:val="20"/>
+              </w:rPr>
+              <w:t>06/08/2026</w:t>
+            </w:r>
+          </w:p>
+        </w:tc>
+        <w:tc>
+          <w:tcPr>
+            <w:tcW w:type="dxa" w:w="4819"/>
+          </w:tcPr>
+          <w:p>
+            <w:r/>
+            <w:r>
+              <w:rPr>
+                <w:sz w:val="20"/>
+              </w:rPr>
+              <w:t>Configurations → System prompts: bỏ stage Field validation — còn 3 stage</w:t>
+            </w:r>
+          </w:p>
+        </w:tc>
+        <w:tc>
+          <w:tcPr>
+            <w:tcW w:type="dxa" w:w="1984"/>
+          </w:tcPr>
+          <w:p>
+            <w:r/>
+            <w:r>
+              <w:rPr>
+                <w:sz w:val="20"/>
+              </w:rPr>
+              <w:t>&lt;PM/BA điền tên&gt;</w:t>
+            </w:r>
+          </w:p>
+        </w:tc>
+      </w:tr>
+      <w:tr>
+        <w:tc>
+          <w:tcPr>
+            <w:tcW w:type="dxa" w:w="1417"/>
+          </w:tcPr>
+          <w:p>
+            <w:r/>
+            <w:r>
+              <w:rPr>
+                <w:sz w:val="20"/>
+              </w:rPr>
+              <w:t>1.18</w:t>
+            </w:r>
+          </w:p>
+        </w:tc>
+        <w:tc>
+          <w:tcPr>
+            <w:tcW w:type="dxa" w:w="1701"/>
+          </w:tcPr>
+          <w:p>
+            <w:r/>
+            <w:r>
+              <w:rPr>
+                <w:sz w:val="20"/>
+              </w:rPr>
+              <w:t>06/08/2026</w:t>
+            </w:r>
+          </w:p>
+        </w:tc>
+        <w:tc>
+          <w:tcPr>
+            <w:tcW w:type="dxa" w:w="4819"/>
+          </w:tcPr>
+          <w:p>
+            <w:r/>
+            <w:r>
+              <w:rPr>
+                <w:sz w:val="20"/>
+              </w:rPr>
+              <w:t>Mô tả chức năng + logic cấu hình/dùng cho 3 System Prompt stages (checklist_review, chat_edit, ai_summary_fairness) dành cho BA/Dev</w:t>
+            </w:r>
+          </w:p>
+        </w:tc>
+        <w:tc>
+          <w:tcPr>
+            <w:tcW w:type="dxa" w:w="1984"/>
+          </w:tcPr>
+          <w:p>
+            <w:r/>
+            <w:r>
+              <w:rPr>
+                <w:sz w:val="20"/>
+              </w:rPr>
+              <w:t>&lt;PM/BA điền tên&gt;</w:t>
+            </w:r>
+          </w:p>
+        </w:tc>
+      </w:tr>
     </w:tbl>
     <w:p/>
     <w:p>
@@ -3530,7 +3776,7 @@
               <w:rPr>
                 <w:sz w:val="20"/>
               </w:rPr>
-              <w:t>Bộ prompt điều khiển hành vi AI theo 4 stage, quản lý bằng file trong Git, IT sửa qua UI có validate + CI</w:t>
+              <w:t>Bộ prompt điều khiển hành vi AI theo 3 stage (checklist_review · chat_edit · ai_summary_fairness), quản lý bằng file trong Git, IT sửa qua UI có validate + CI</w:t>
             </w:r>
           </w:p>
         </w:tc>
@@ -15719,7 +15965,7 @@
         <w:pStyle w:val="ListBullet"/>
       </w:pPr>
       <w:r>
-        <w:t>IT quản trị Form lists (các dropdown form Tạo tài liệu / Thông tin hợp đồng) và System Prompt 4 stage.</w:t>
+        <w:t>IT quản trị Form lists (các dropdown form Tạo tài liệu / Thông tin hợp đồng) và System Prompt 3 stage.</w:t>
       </w:r>
     </w:p>
     <w:p>
@@ -15773,7 +16019,7 @@
             <w:r>
               <w:drawing>
                 <wp:inline xmlns:a="http://schemas.openxmlformats.org/drawingml/2006/main" xmlns:pic="http://schemas.openxmlformats.org/drawingml/2006/picture">
-                  <wp:extent cx="3592800" cy="5938512"/>
+                  <wp:extent cx="3520800" cy="5939930"/>
                   <wp:docPr id="24" name="Picture 24"/>
                   <wp:cNvGraphicFramePr>
                     <a:graphicFrameLocks noChangeAspect="1"/>
@@ -15794,7 +16040,7 @@
                         <pic:spPr>
                           <a:xfrm>
                             <a:off x="0" y="0"/>
-                            <a:ext cx="3592800" cy="5938512"/>
+                            <a:ext cx="3520800" cy="5939930"/>
                           </a:xfrm>
                           <a:prstGeom prst="rect"/>
                         </pic:spPr>
@@ -16653,15 +16899,94 @@
         <w:t>5.3.2 Màn hình Configurations — tab System prompts</w:t>
       </w:r>
     </w:p>
+    <w:tbl>
+      <w:tblPr>
+        <w:tblW w:type="auto" w:w="0"/>
+        <w:tblLayout w:type="autofit"/>
+        <w:tblLook w:firstColumn="1" w:firstRow="1" w:lastColumn="0" w:lastRow="0" w:noHBand="0" w:noVBand="1" w:val="04A0"/>
+        <w:tblBorders>
+          <w:top w:val="nil" w:sz="0" w:space="0" w:color="auto"/>
+          <w:left w:val="nil" w:sz="0" w:space="0" w:color="auto"/>
+          <w:bottom w:val="nil" w:sz="0" w:space="0" w:color="auto"/>
+          <w:right w:val="nil" w:sz="0" w:space="0" w:color="auto"/>
+          <w:insideH w:val="nil" w:sz="0" w:space="0" w:color="auto"/>
+          <w:insideV w:val="nil" w:sz="0" w:space="0" w:color="auto"/>
+        </w:tblBorders>
+      </w:tblPr>
+      <w:tblGrid>
+        <w:gridCol w:w="9638"/>
+      </w:tblGrid>
+      <w:tr>
+        <w:trPr>
+          <w:cantSplit w:val="true"/>
+        </w:trPr>
+        <w:tc>
+          <w:tcPr>
+            <w:tcW w:type="dxa" w:w="9638"/>
+          </w:tcPr>
+          <w:p>
+            <w:pPr>
+              <w:spacing w:before="120" w:after="80"/>
+              <w:jc w:val="center"/>
+              <w:keepNext w:val="true"/>
+              <w:keepLines w:val="true"/>
+            </w:pPr>
+            <w:r>
+              <w:drawing>
+                <wp:inline xmlns:a="http://schemas.openxmlformats.org/drawingml/2006/main" xmlns:pic="http://schemas.openxmlformats.org/drawingml/2006/picture">
+                  <wp:extent cx="5940000" cy="3341250"/>
+                  <wp:docPr id="26" name="Picture 26"/>
+                  <wp:cNvGraphicFramePr>
+                    <a:graphicFrameLocks noChangeAspect="1"/>
+                  </wp:cNvGraphicFramePr>
+                  <a:graphic>
+                    <a:graphicData uri="http://schemas.openxmlformats.org/drawingml/2006/picture">
+                      <pic:pic>
+                        <pic:nvPicPr>
+                          <pic:cNvPr id="0" name="31_it_system_prompts.png"/>
+                          <pic:cNvPicPr/>
+                        </pic:nvPicPr>
+                        <pic:blipFill>
+                          <a:blip r:embed="rId34"/>
+                          <a:stretch>
+                            <a:fillRect/>
+                          </a:stretch>
+                        </pic:blipFill>
+                        <pic:spPr>
+                          <a:xfrm>
+                            <a:off x="0" y="0"/>
+                            <a:ext cx="5940000" cy="3341250"/>
+                          </a:xfrm>
+                          <a:prstGeom prst="rect"/>
+                        </pic:spPr>
+                      </pic:pic>
+                    </a:graphicData>
+                  </a:graphic>
+                </wp:inline>
+              </w:drawing>
+            </w:r>
+          </w:p>
+          <w:p>
+            <w:pPr>
+              <w:spacing w:before="40" w:after="160"/>
+              <w:jc w:val="center"/>
+            </w:pPr>
+            <w:r>
+              <w:rPr>
+                <w:i/>
+                <w:color w:val="666666"/>
+                <w:sz w:val="18"/>
+              </w:rPr>
+              <w:t>Hình 24b — Configurations / System prompts (3 stage)</w:t>
+            </w:r>
+          </w:p>
+        </w:tc>
+      </w:tr>
+    </w:tbl>
     <w:p>
-      <w:r>
-        <w:rPr>
-          <w:b w:val="0"/>
-          <w:i/>
-          <w:sz w:val="20"/>
-        </w:rPr>
-        <w:t>(Tab cùng màn Configurations — chuyển tab trên UI; ảnh minh họa Form lists ở Hình 24.)</w:t>
-      </w:r>
+      <w:pPr>
+        <w:spacing w:before="0" w:after="200"/>
+      </w:pPr>
     </w:p>
     <w:p>
       <w:r>
@@ -16670,7 +16995,7 @@
           <w:i w:val="0"/>
           <w:sz w:val="20"/>
         </w:rPr>
-        <w:t>Mục đích: Cho IT xem/sửa System Prompt CURRENT theo từng stage hành vi AI.</w:t>
+        <w:t>Mục đích: Cho IT xem/sửa System Prompt CURRENT theo từng stage hành vi AI (tách khỏi checklist pháp lý của Legal).</w:t>
       </w:r>
     </w:p>
     <w:p>
@@ -16680,7 +17005,7 @@
           <w:i w:val="0"/>
           <w:sz w:val="20"/>
         </w:rPr>
-        <w:t>Người dùng: Chỉ IT.  |  Điều kiện: Đăng nhập IT; file prompt nằm trong Git (prompts/&lt;stage&gt;/).</w:t>
+        <w:t>Người dùng: User có quyền System prompts (mặc định Role IT).  |  Điều kiện: Đăng nhập; quyền system_prompts; file nằm tại repo /prompts/&lt;stage&gt;/.</w:t>
       </w:r>
     </w:p>
     <w:p>
@@ -16777,7 +17102,7 @@
               <w:rPr>
                 <w:sz w:val="20"/>
               </w:rPr>
-              <w:t>Danh sách 4 stage</w:t>
+              <w:t>Accordion Checklist review (first-pass)</w:t>
             </w:r>
           </w:p>
         </w:tc>
@@ -16791,7 +17116,7 @@
               <w:rPr>
                 <w:sz w:val="20"/>
               </w:rPr>
-              <w:t>checklist_review · chat_edit · ai_summary_fairness · field_validation.</w:t>
+              <w:t>Stage checklist_review — mở để sửa CURRENT.</w:t>
             </w:r>
           </w:p>
         </w:tc>
@@ -16821,7 +17146,7 @@
               <w:rPr>
                 <w:sz w:val="20"/>
               </w:rPr>
-              <w:t>Editor nội dung CURRENT</w:t>
+              <w:t>Accordion Chat edit</w:t>
             </w:r>
           </w:p>
         </w:tc>
@@ -16835,7 +17160,7 @@
               <w:rPr>
                 <w:sz w:val="20"/>
               </w:rPr>
-              <w:t>Sửa markdown/prompt; không hardcode điều khoản pháp lý.</w:t>
+              <w:t>Stage chat_edit.</w:t>
             </w:r>
           </w:p>
         </w:tc>
@@ -16865,7 +17190,7 @@
               <w:rPr>
                 <w:sz w:val="20"/>
               </w:rPr>
-              <w:t>Validate placeholder</w:t>
+              <w:t>Accordion AI summary &amp; fairness</w:t>
             </w:r>
           </w:p>
         </w:tc>
@@ -16879,7 +17204,7 @@
               <w:rPr>
                 <w:sz w:val="20"/>
               </w:rPr>
-              <w:t>Kiểm tra {{checklist_items}} và các placeholder bắt buộc trước khi lưu.</w:t>
+              <w:t>Stage ai_summary_fairness.</w:t>
             </w:r>
           </w:p>
         </w:tc>
@@ -16909,7 +17234,7 @@
               <w:rPr>
                 <w:sz w:val="20"/>
               </w:rPr>
-              <w:t>Nút Lưu</w:t>
+              <w:t>Editor nội dung CURRENT</w:t>
             </w:r>
           </w:p>
         </w:tc>
@@ -16923,7 +17248,7 @@
               <w:rPr>
                 <w:sz w:val="20"/>
               </w:rPr>
-              <w:t>Ghi vào Git / current.json sau khi validate đạt.</w:t>
+              <w:t>Markdown/prompt; không hardcode điều khoản pháp lý.</w:t>
             </w:r>
           </w:p>
         </w:tc>
@@ -16953,7 +17278,7 @@
               <w:rPr>
                 <w:sz w:val="20"/>
               </w:rPr>
-              <w:t>Shared injection_guard</w:t>
+              <w:t>Validate + Lưu</w:t>
             </w:r>
           </w:p>
         </w:tc>
@@ -16967,7 +17292,7 @@
               <w:rPr>
                 <w:sz w:val="20"/>
               </w:rPr>
-              <w:t>Prompt chống injection dùng chung các stage.</w:t>
+              <w:t>Chặn placeholder lạ / heuristic hardcode; ghi đè file v*.md đang trỏ bởi current.json.</w:t>
             </w:r>
           </w:p>
         </w:tc>
@@ -16989,7 +17314,7 @@
         <w:pStyle w:val="ListBullet"/>
       </w:pPr>
       <w:r>
-        <w:t>Validate fail → không lưu, báo lỗi rõ.</w:t>
+        <w:t>Mỗi stage collapse mặc định — bấm title để mở.</w:t>
       </w:r>
     </w:p>
     <w:p>
@@ -16997,7 +17322,7 @@
         <w:pStyle w:val="ListBullet"/>
       </w:pPr>
       <w:r>
-        <w:t>Thay đổi trên Git phải qua CI validate-prompts mới merge.</w:t>
+        <w:t>Validate fail → không lưu.</w:t>
       </w:r>
     </w:p>
     <w:p>
@@ -17005,7 +17330,15 @@
         <w:pStyle w:val="ListBullet"/>
       </w:pPr>
       <w:r>
-        <w:t>Checklist (nội dung pháp lý) thuộc Legal — tách khỏi System Prompt.</w:t>
+        <w:t>Thay đổi trên Git phải qua CI scripts/validate-prompts.js mới merge.</w:t>
+      </w:r>
+    </w:p>
+    <w:p>
+      <w:pPr>
+        <w:pStyle w:val="ListBullet"/>
+      </w:pPr>
+      <w:r>
+        <w:t>Runtime load: injection_guard.md + body CURRENT (loadSystemPrompt).</w:t>
       </w:r>
     </w:p>
     <w:p>
@@ -17019,6 +17352,1286 @@
       </w:r>
     </w:p>
     <w:p/>
+    <w:p>
+      <w:pPr>
+        <w:pStyle w:val="Heading4"/>
+      </w:pPr>
+      <w:r>
+        <w:t>5.3.3 Nguyên tắc cấu hình System Prompt (cho Dev / IT)</w:t>
+      </w:r>
+    </w:p>
+    <w:p>
+      <w:pPr>
+        <w:pStyle w:val="ListBullet"/>
+      </w:pPr>
+      <w:r>
+        <w:t>Source of truth: thư mục Git `/prompts/&lt;stage&gt;/` + `current.json` trỏ file `vN.md` đang dùng.</w:t>
+      </w:r>
+    </w:p>
+    <w:p>
+      <w:pPr>
+        <w:pStyle w:val="ListBullet"/>
+      </w:pPr>
+      <w:r>
+        <w:t>UI Configurations chỉ sửa file CURRENT (raw, không gồm injection_guard). Khi gọi LLM, backend luôn ghép: `prompts/_shared/injection_guard.md` + `---` + body stage.</w:t>
+      </w:r>
+    </w:p>
+    <w:p>
+      <w:pPr>
+        <w:pStyle w:val="ListBullet"/>
+      </w:pPr>
+      <w:r>
+        <w:t>Placeholder chỉ được dùng đúng whitelist từng stage (`STAGE_PLACEHOLDERS` trong `frontend/src/lib/system-prompts/constants.ts`). CI và API save cùng rule.</w:t>
+      </w:r>
+    </w:p>
+    <w:p>
+      <w:pPr>
+        <w:pStyle w:val="ListBullet"/>
+      </w:pPr>
+      <w:r>
+        <w:t>Không hardcode Ideal/Fallback/Red Line, số ngày, %… trong prompt — mọi rule pháp lý inject qua `{{checklist_items}}` từ Cấu hình hợp đồng (Legal).</w:t>
+      </w:r>
+    </w:p>
+    <w:p>
+      <w:pPr>
+        <w:pStyle w:val="ListBullet"/>
+      </w:pPr>
+      <w:r>
+        <w:t>Code load: `loadSystemPrompt(stage)` / `loadSystemPromptRaw(stage)` trong `frontend/src/lib/system-prompts/index.ts`. API IT: `GET/POST /api/system-prompts`.</w:t>
+      </w:r>
+    </w:p>
+    <w:p>
+      <w:pPr>
+        <w:pStyle w:val="ListBullet"/>
+      </w:pPr>
+      <w:r>
+        <w:t>Demo hiện tại: UI + validate + lưu file đã có; pipeline AI review/chat/insight chưa nối thật các stage (mock heuristic) — khi implement LLM phải thay placeholder rồi gửi prompt đã compose.</w:t>
+      </w:r>
+    </w:p>
+    <w:p>
+      <w:r>
+        <w:rPr>
+          <w:i/>
+          <w:color w:val="B05000"/>
+          <w:sz w:val="20"/>
+        </w:rPr>
+        <w:t>Ghi chú: Khi đổi prompt production: tạo v(N+1).md → cập nhật current.json → PR + CI pass. Không sửa in-place file đã dùng production.</w:t>
+      </w:r>
+    </w:p>
+    <w:p>
+      <w:r>
+        <w:rPr>
+          <w:b/>
+          <w:i w:val="0"/>
+          <w:sz w:val="20"/>
+        </w:rPr>
+        <w:t>Bảng tổng quan 3 stage:</w:t>
+      </w:r>
+    </w:p>
+    <w:tbl>
+      <w:tblPr>
+        <w:tblStyle w:val="TableGrid"/>
+        <w:tblW w:type="auto" w:w="0"/>
+        <w:jc w:val="center"/>
+        <w:tblLook w:firstColumn="1" w:firstRow="1" w:lastColumn="0" w:lastRow="0" w:noHBand="0" w:noVBand="1" w:val="04A0"/>
+      </w:tblPr>
+      <w:tblGrid>
+        <w:gridCol w:w="2409"/>
+        <w:gridCol w:w="2409"/>
+        <w:gridCol w:w="2409"/>
+        <w:gridCol w:w="2409"/>
+      </w:tblGrid>
+      <w:tr>
+        <w:tc>
+          <w:tcPr>
+            <w:tcW w:type="dxa" w:w="1814"/>
+          </w:tcPr>
+          <w:p>
+            <w:r/>
+            <w:r>
+              <w:rPr>
+                <w:b/>
+                <w:sz w:val="20"/>
+              </w:rPr>
+              <w:t>Stage (UI / folder)</w:t>
+            </w:r>
+          </w:p>
+        </w:tc>
+        <w:tc>
+          <w:tcPr>
+            <w:tcW w:type="dxa" w:w="2381"/>
+          </w:tcPr>
+          <w:p>
+            <w:r/>
+            <w:r>
+              <w:rPr>
+                <w:b/>
+                <w:sz w:val="20"/>
+              </w:rPr>
+              <w:t>Khi nào gọi</w:t>
+            </w:r>
+          </w:p>
+        </w:tc>
+        <w:tc>
+          <w:tcPr>
+            <w:tcW w:type="dxa" w:w="2381"/>
+          </w:tcPr>
+          <w:p>
+            <w:r/>
+            <w:r>
+              <w:rPr>
+                <w:b/>
+                <w:sz w:val="20"/>
+              </w:rPr>
+              <w:t>Input (placeholder)</w:t>
+            </w:r>
+          </w:p>
+        </w:tc>
+        <w:tc>
+          <w:tcPr>
+            <w:tcW w:type="dxa" w:w="3061"/>
+          </w:tcPr>
+          <w:p>
+            <w:r/>
+            <w:r>
+              <w:rPr>
+                <w:b/>
+                <w:sz w:val="20"/>
+              </w:rPr>
+              <w:t>Output kỳ vọng</w:t>
+            </w:r>
+          </w:p>
+        </w:tc>
+      </w:tr>
+      <w:tr>
+        <w:tc>
+          <w:tcPr>
+            <w:tcW w:type="dxa" w:w="1814"/>
+          </w:tcPr>
+          <w:p>
+            <w:r/>
+            <w:r>
+              <w:rPr>
+                <w:sz w:val="20"/>
+              </w:rPr>
+              <w:t>Checklist review</w:t>
+              <w:br/>
+              <w:t>checklist_review</w:t>
+            </w:r>
+          </w:p>
+        </w:tc>
+        <w:tc>
+          <w:tcPr>
+            <w:tcW w:type="dxa" w:w="2381"/>
+          </w:tcPr>
+          <w:p>
+            <w:r/>
+            <w:r>
+              <w:rPr>
+                <w:sz w:val="20"/>
+              </w:rPr>
+              <w:t>Lần đầu HĐ vào Processing Queue / chạy AI review (Bước AI handle)</w:t>
+            </w:r>
+          </w:p>
+        </w:tc>
+        <w:tc>
+          <w:tcPr>
+            <w:tcW w:type="dxa" w:w="2381"/>
+          </w:tcPr>
+          <w:p>
+            <w:r/>
+            <w:r>
+              <w:rPr>
+                <w:sz w:val="20"/>
+              </w:rPr>
+              <w:t>{{contract_type}}</w:t>
+              <w:br/>
+              <w:t>{{checklist_items}}</w:t>
+              <w:br/>
+              <w:t>{{document_text}}</w:t>
+            </w:r>
+          </w:p>
+        </w:tc>
+        <w:tc>
+          <w:tcPr>
+            <w:tcW w:type="dxa" w:w="3061"/>
+          </w:tcPr>
+          <w:p>
+            <w:r/>
+            <w:r>
+              <w:rPr>
+                <w:sz w:val="20"/>
+              </w:rPr>
+              <w:t>JSON findings: Red Flag / Warning / Protection / Missing Protection + đề xuất Loại A/B</w:t>
+            </w:r>
+          </w:p>
+        </w:tc>
+      </w:tr>
+      <w:tr>
+        <w:tc>
+          <w:tcPr>
+            <w:tcW w:type="dxa" w:w="1814"/>
+          </w:tcPr>
+          <w:p>
+            <w:r/>
+            <w:r>
+              <w:rPr>
+                <w:sz w:val="20"/>
+              </w:rPr>
+              <w:t>Chat edit</w:t>
+              <w:br/>
+              <w:t>chat_edit</w:t>
+            </w:r>
+          </w:p>
+        </w:tc>
+        <w:tc>
+          <w:tcPr>
+            <w:tcW w:type="dxa" w:w="2381"/>
+          </w:tcPr>
+          <w:p>
+            <w:r/>
+            <w:r>
+              <w:rPr>
+                <w:sz w:val="20"/>
+              </w:rPr>
+              <w:t>Purchasing gõ Chat yêu cầu sửa thêm (PT1) trên AI Workspace</w:t>
+            </w:r>
+          </w:p>
+        </w:tc>
+        <w:tc>
+          <w:tcPr>
+            <w:tcW w:type="dxa" w:w="2381"/>
+          </w:tcPr>
+          <w:p>
+            <w:r/>
+            <w:r>
+              <w:rPr>
+                <w:sz w:val="20"/>
+              </w:rPr>
+              <w:t>{{contract_type}}</w:t>
+              <w:br/>
+              <w:t>{{checklist_items}}</w:t>
+              <w:br/>
+              <w:t>{{conversation_history}}</w:t>
+              <w:br/>
+              <w:t>{{current_document_state}}</w:t>
+            </w:r>
+          </w:p>
+        </w:tc>
+        <w:tc>
+          <w:tcPr>
+            <w:tcW w:type="dxa" w:w="3061"/>
+          </w:tcPr>
+          <w:p>
+            <w:r/>
+            <w:r>
+              <w:rPr>
+                <w:sz w:val="20"/>
+              </w:rPr>
+              <w:t>Trả lời tiếng Việt + diff/đoạn thay thế trên vùng mở; từ chối nếu vượt Red Line</w:t>
+            </w:r>
+          </w:p>
+        </w:tc>
+      </w:tr>
+      <w:tr>
+        <w:tc>
+          <w:tcPr>
+            <w:tcW w:type="dxa" w:w="1814"/>
+          </w:tcPr>
+          <w:p>
+            <w:r/>
+            <w:r>
+              <w:rPr>
+                <w:sz w:val="20"/>
+              </w:rPr>
+              <w:t>AI summary &amp; fairness</w:t>
+              <w:br/>
+              <w:t>ai_summary_fairness</w:t>
+            </w:r>
+          </w:p>
+        </w:tc>
+        <w:tc>
+          <w:tcPr>
+            <w:tcW w:type="dxa" w:w="2381"/>
+          </w:tcPr>
+          <w:p>
+            <w:r/>
+            <w:r>
+              <w:rPr>
+                <w:sz w:val="20"/>
+              </w:rPr>
+              <w:t>Sau khi có findings (hoặc mỗi lần cập nhật insight / popup % tin cậy · Fairness)</w:t>
+            </w:r>
+          </w:p>
+        </w:tc>
+        <w:tc>
+          <w:tcPr>
+            <w:tcW w:type="dxa" w:w="2381"/>
+          </w:tcPr>
+          <w:p>
+            <w:r/>
+            <w:r>
+              <w:rPr>
+                <w:sz w:val="20"/>
+              </w:rPr>
+              <w:t>{{contract_type}}</w:t>
+              <w:br/>
+              <w:t>{{findings}}</w:t>
+              <w:br/>
+              <w:t>{{approval_matrix_context}}</w:t>
+            </w:r>
+          </w:p>
+        </w:tc>
+        <w:tc>
+          <w:tcPr>
+            <w:tcW w:type="dxa" w:w="3061"/>
+          </w:tcPr>
+          <w:p>
+            <w:r/>
+            <w:r>
+              <w:rPr>
+                <w:sz w:val="20"/>
+              </w:rPr>
+              <w:t>JSON { aiSummary, fairnessNotes } — tách biệt AI Confidence vs Fairness Score</w:t>
+            </w:r>
+          </w:p>
+        </w:tc>
+      </w:tr>
+    </w:tbl>
+    <w:p/>
+    <w:p>
+      <w:pPr>
+        <w:pStyle w:val="Heading4"/>
+      </w:pPr>
+      <w:r>
+        <w:t>5.3.4 Stage 1 — Checklist review (first-pass)</w:t>
+      </w:r>
+    </w:p>
+    <w:p>
+      <w:r>
+        <w:rPr>
+          <w:b/>
+          <w:i w:val="0"/>
+          <w:sz w:val="20"/>
+        </w:rPr>
+        <w:t>Mục đích chức năng:</w:t>
+      </w:r>
+    </w:p>
+    <w:p>
+      <w:pPr>
+        <w:pStyle w:val="ListBullet"/>
+      </w:pPr>
+      <w:r>
+        <w:t>Rà soát toàn bộ văn bản HĐ so với checklist Legal của loại HĐ; sinh danh sách phát hiện + đề xuất chỉnh sửa có căn cứ.</w:t>
+      </w:r>
+    </w:p>
+    <w:p>
+      <w:pPr>
+        <w:pStyle w:val="ListBullet"/>
+      </w:pPr>
+      <w:r>
+        <w:t>Là bước AI chính khi tạo tài liệu / queue xử lý — trước khi Purchasing thấy workspace đầy đủ.</w:t>
+      </w:r>
+    </w:p>
+    <w:p>
+      <w:r>
+        <w:rPr>
+          <w:b/>
+          <w:i w:val="0"/>
+          <w:sz w:val="20"/>
+        </w:rPr>
+        <w:t>Logic cấu hình &amp; sử dụng (Dev):</w:t>
+      </w:r>
+    </w:p>
+    <w:p>
+      <w:pPr>
+        <w:pStyle w:val="ListBullet"/>
+      </w:pPr>
+      <w:r>
+        <w:t>Folder: `prompts/checklist_review/` · pointer: `current.json` → `v1.md` (hoặc vN).</w:t>
+      </w:r>
+    </w:p>
+    <w:p>
+      <w:pPr>
+        <w:pStyle w:val="ListBullet"/>
+      </w:pPr>
+      <w:r>
+        <w:t>Khi implement pipeline: serialize checklist đã Lưu của `contractTypeId` → `{{checklist_items}}`; extract text/.docx → `{{document_text}}`; label loại → `{{contract_type}}`.</w:t>
+      </w:r>
+    </w:p>
+    <w:p>
+      <w:pPr>
+        <w:pStyle w:val="ListBullet"/>
+      </w:pPr>
+      <w:r>
+        <w:t>Gọi: `const system = loadSystemPrompt("checklist_review")` rồi thay placeholder → gửi LLM local.</w:t>
+      </w:r>
+    </w:p>
+    <w:p>
+      <w:pPr>
+        <w:pStyle w:val="ListBullet"/>
+      </w:pPr>
+      <w:r>
+        <w:t>Parse JSON findings → map sang đề xuất Loại A (vùng mở, Accept/Undo) / Loại B (vùng khoá, chỉ annotation); gắn `code` điều khoản checklist khi có.</w:t>
+      </w:r>
+    </w:p>
+    <w:p>
+      <w:pPr>
+        <w:pStyle w:val="ListBullet"/>
+      </w:pPr>
+      <w:r>
+        <w:t>Prompt bắt buộc: ưu tiên Ideal → Fallback; không tự chèn vượt Red Line; không bịa rule ngoài checklist.</w:t>
+      </w:r>
+    </w:p>
+    <w:tbl>
+      <w:tblPr>
+        <w:tblStyle w:val="TableGrid"/>
+        <w:tblW w:type="auto" w:w="0"/>
+        <w:jc w:val="center"/>
+        <w:tblLook w:firstColumn="1" w:firstRow="1" w:lastColumn="0" w:lastRow="0" w:noHBand="0" w:noVBand="1" w:val="04A0"/>
+      </w:tblPr>
+      <w:tblGrid>
+        <w:gridCol w:w="3213"/>
+        <w:gridCol w:w="3213"/>
+        <w:gridCol w:w="3213"/>
+      </w:tblGrid>
+      <w:tr>
+        <w:tc>
+          <w:tcPr>
+            <w:tcW w:type="dxa" w:w="2268"/>
+          </w:tcPr>
+          <w:p>
+            <w:r/>
+            <w:r>
+              <w:rPr>
+                <w:b/>
+                <w:sz w:val="20"/>
+              </w:rPr>
+              <w:t>Placeholder</w:t>
+            </w:r>
+          </w:p>
+        </w:tc>
+        <w:tc>
+          <w:tcPr>
+            <w:tcW w:type="dxa" w:w="3969"/>
+          </w:tcPr>
+          <w:p>
+            <w:r/>
+            <w:r>
+              <w:rPr>
+                <w:b/>
+                <w:sz w:val="20"/>
+              </w:rPr>
+              <w:t>Nguồn dữ liệu runtime</w:t>
+            </w:r>
+          </w:p>
+        </w:tc>
+        <w:tc>
+          <w:tcPr>
+            <w:tcW w:type="dxa" w:w="3402"/>
+          </w:tcPr>
+          <w:p>
+            <w:r/>
+            <w:r>
+              <w:rPr>
+                <w:b/>
+                <w:sz w:val="20"/>
+              </w:rPr>
+              <w:t>Ghi chú</w:t>
+            </w:r>
+          </w:p>
+        </w:tc>
+      </w:tr>
+      <w:tr>
+        <w:tc>
+          <w:tcPr>
+            <w:tcW w:type="dxa" w:w="2268"/>
+          </w:tcPr>
+          <w:p>
+            <w:r/>
+            <w:r>
+              <w:rPr>
+                <w:sz w:val="20"/>
+              </w:rPr>
+              <w:t>{{contract_type}}</w:t>
+            </w:r>
+          </w:p>
+        </w:tc>
+        <w:tc>
+          <w:tcPr>
+            <w:tcW w:type="dxa" w:w="3969"/>
+          </w:tcPr>
+          <w:p>
+            <w:r/>
+            <w:r>
+              <w:rPr>
+                <w:sz w:val="20"/>
+              </w:rPr>
+              <w:t>Loại giá trị HĐ / contractTypeLabel</w:t>
+            </w:r>
+          </w:p>
+        </w:tc>
+        <w:tc>
+          <w:tcPr>
+            <w:tcW w:type="dxa" w:w="3402"/>
+          </w:tcPr>
+          <w:p>
+            <w:r/>
+            <w:r>
+              <w:rPr>
+                <w:sz w:val="20"/>
+              </w:rPr>
+              <w:t>Chuỗi id hoặc label</w:t>
+            </w:r>
+          </w:p>
+        </w:tc>
+      </w:tr>
+      <w:tr>
+        <w:tc>
+          <w:tcPr>
+            <w:tcW w:type="dxa" w:w="2268"/>
+          </w:tcPr>
+          <w:p>
+            <w:r/>
+            <w:r>
+              <w:rPr>
+                <w:sz w:val="20"/>
+              </w:rPr>
+              <w:t>{{checklist_items}}</w:t>
+            </w:r>
+          </w:p>
+        </w:tc>
+        <w:tc>
+          <w:tcPr>
+            <w:tcW w:type="dxa" w:w="3969"/>
+          </w:tcPr>
+          <w:p>
+            <w:r/>
+            <w:r>
+              <w:rPr>
+                <w:sz w:val="20"/>
+              </w:rPr>
+              <w:t>Cấu hình hợp đồng → clauses (Ideal/Fallback/Red Line, severity, keywords…)</w:t>
+            </w:r>
+          </w:p>
+        </w:tc>
+        <w:tc>
+          <w:tcPr>
+            <w:tcW w:type="dxa" w:w="3402"/>
+          </w:tcPr>
+          <w:p>
+            <w:r/>
+            <w:r>
+              <w:rPr>
+                <w:sz w:val="20"/>
+              </w:rPr>
+              <w:t>Nguồn sự thật pháp lý duy nhất</w:t>
+            </w:r>
+          </w:p>
+        </w:tc>
+      </w:tr>
+      <w:tr>
+        <w:tc>
+          <w:tcPr>
+            <w:tcW w:type="dxa" w:w="2268"/>
+          </w:tcPr>
+          <w:p>
+            <w:r/>
+            <w:r>
+              <w:rPr>
+                <w:sz w:val="20"/>
+              </w:rPr>
+              <w:t>{{document_text}}</w:t>
+            </w:r>
+          </w:p>
+        </w:tc>
+        <w:tc>
+          <w:tcPr>
+            <w:tcW w:type="dxa" w:w="3969"/>
+          </w:tcPr>
+          <w:p>
+            <w:r/>
+            <w:r>
+              <w:rPr>
+                <w:sz w:val="20"/>
+              </w:rPr>
+              <w:t>Text extract từ file .docx review</w:t>
+            </w:r>
+          </w:p>
+        </w:tc>
+        <w:tc>
+          <w:tcPr>
+            <w:tcW w:type="dxa" w:w="3402"/>
+          </w:tcPr>
+          <w:p>
+            <w:r/>
+            <w:r>
+              <w:rPr>
+                <w:sz w:val="20"/>
+              </w:rPr>
+              <w:t>Toàn văn hoặc excerpt theo engine</w:t>
+            </w:r>
+          </w:p>
+        </w:tc>
+      </w:tr>
+    </w:tbl>
+    <w:p/>
+    <w:p>
+      <w:pPr>
+        <w:pStyle w:val="Heading4"/>
+      </w:pPr>
+      <w:r>
+        <w:t>5.3.5 Stage 2 — Chat edit</w:t>
+      </w:r>
+    </w:p>
+    <w:p>
+      <w:r>
+        <w:rPr>
+          <w:b/>
+          <w:i w:val="0"/>
+          <w:sz w:val="20"/>
+        </w:rPr>
+        <w:t>Mục đích chức năng:</w:t>
+      </w:r>
+    </w:p>
+    <w:p>
+      <w:pPr>
+        <w:pStyle w:val="ListBullet"/>
+      </w:pPr>
+      <w:r>
+        <w:t>Hỗ trợ Purchasing chỉnh sửa HĐ qua Chat (PT1) trong khi vẫn tuân thủ checklist Legal và write-back allow-list vùng mở.</w:t>
+      </w:r>
+    </w:p>
+    <w:p>
+      <w:pPr>
+        <w:pStyle w:val="ListBullet"/>
+      </w:pPr>
+      <w:r>
+        <w:t>Không thay thế Checklist review — chỉ xử lý yêu cầu hội thoại tiếp theo trên bản đã có.</w:t>
+      </w:r>
+    </w:p>
+    <w:p>
+      <w:r>
+        <w:rPr>
+          <w:b/>
+          <w:i w:val="0"/>
+          <w:sz w:val="20"/>
+        </w:rPr>
+        <w:t>Logic cấu hình &amp; sử dụng (Dev):</w:t>
+      </w:r>
+    </w:p>
+    <w:p>
+      <w:pPr>
+        <w:pStyle w:val="ListBullet"/>
+      </w:pPr>
+      <w:r>
+        <w:t>Folder: `prompts/chat_edit/` · `current.json` → `vN.md`.</w:t>
+      </w:r>
+    </w:p>
+    <w:p>
+      <w:pPr>
+        <w:pStyle w:val="ListBullet"/>
+      </w:pPr>
+      <w:r>
+        <w:t>Mỗi tin nhắn Chat: build `{{conversation_history}}` (các turn trước + tin mới); `{{current_document_state}}` = bản reviewed hiện tại (hoặc đoạn liên quan); vẫn inject `{{checklist_items}}` mới nhất.</w:t>
+      </w:r>
+    </w:p>
+    <w:p>
+      <w:pPr>
+        <w:pStyle w:val="ListBullet"/>
+      </w:pPr>
+      <w:r>
+        <w:t>Gọi: `loadSystemPrompt("chat_edit")` + thay placeholder → LLM.</w:t>
+      </w:r>
+    </w:p>
+    <w:p>
+      <w:pPr>
+        <w:pStyle w:val="ListBullet"/>
+      </w:pPr>
+      <w:r>
+        <w:t>Áp dụng diff chỉ trên field/vùng mở (Loại A). Nếu user yêu cầu sửa vùng khoá / vượt Red Line → LLM giải thích + escalate, code không ghi đè allow-list.</w:t>
+      </w:r>
+    </w:p>
+    <w:p>
+      <w:pPr>
+        <w:pStyle w:val="ListBullet"/>
+      </w:pPr>
+      <w:r>
+        <w:t>UI demo hiện trả canned reply — khi nối LLM thật, thay handler ChatPanel bằng kết quả stage này.</w:t>
+      </w:r>
+    </w:p>
+    <w:tbl>
+      <w:tblPr>
+        <w:tblStyle w:val="TableGrid"/>
+        <w:tblW w:type="auto" w:w="0"/>
+        <w:jc w:val="center"/>
+        <w:tblLook w:firstColumn="1" w:firstRow="1" w:lastColumn="0" w:lastRow="0" w:noHBand="0" w:noVBand="1" w:val="04A0"/>
+      </w:tblPr>
+      <w:tblGrid>
+        <w:gridCol w:w="3213"/>
+        <w:gridCol w:w="3213"/>
+        <w:gridCol w:w="3213"/>
+      </w:tblGrid>
+      <w:tr>
+        <w:tc>
+          <w:tcPr>
+            <w:tcW w:type="dxa" w:w="2268"/>
+          </w:tcPr>
+          <w:p>
+            <w:r/>
+            <w:r>
+              <w:rPr>
+                <w:b/>
+                <w:sz w:val="20"/>
+              </w:rPr>
+              <w:t>Placeholder</w:t>
+            </w:r>
+          </w:p>
+        </w:tc>
+        <w:tc>
+          <w:tcPr>
+            <w:tcW w:type="dxa" w:w="3969"/>
+          </w:tcPr>
+          <w:p>
+            <w:r/>
+            <w:r>
+              <w:rPr>
+                <w:b/>
+                <w:sz w:val="20"/>
+              </w:rPr>
+              <w:t>Nguồn dữ liệu runtime</w:t>
+            </w:r>
+          </w:p>
+        </w:tc>
+        <w:tc>
+          <w:tcPr>
+            <w:tcW w:type="dxa" w:w="3402"/>
+          </w:tcPr>
+          <w:p>
+            <w:r/>
+            <w:r>
+              <w:rPr>
+                <w:b/>
+                <w:sz w:val="20"/>
+              </w:rPr>
+              <w:t>Ghi chú</w:t>
+            </w:r>
+          </w:p>
+        </w:tc>
+      </w:tr>
+      <w:tr>
+        <w:tc>
+          <w:tcPr>
+            <w:tcW w:type="dxa" w:w="2268"/>
+          </w:tcPr>
+          <w:p>
+            <w:r/>
+            <w:r>
+              <w:rPr>
+                <w:sz w:val="20"/>
+              </w:rPr>
+              <w:t>{{contract_type}}</w:t>
+            </w:r>
+          </w:p>
+        </w:tc>
+        <w:tc>
+          <w:tcPr>
+            <w:tcW w:type="dxa" w:w="3969"/>
+          </w:tcPr>
+          <w:p>
+            <w:r/>
+            <w:r>
+              <w:rPr>
+                <w:sz w:val="20"/>
+              </w:rPr>
+              <w:t>Loại HĐ của review</w:t>
+            </w:r>
+          </w:p>
+        </w:tc>
+        <w:tc>
+          <w:tcPr>
+            <w:tcW w:type="dxa" w:w="3402"/>
+          </w:tcPr>
+          <w:p>
+            <w:r/>
+            <w:r>
+              <w:rPr>
+                <w:sz w:val="20"/>
+              </w:rPr>
+              <w:t>Giống stage 1</w:t>
+            </w:r>
+          </w:p>
+        </w:tc>
+      </w:tr>
+      <w:tr>
+        <w:tc>
+          <w:tcPr>
+            <w:tcW w:type="dxa" w:w="2268"/>
+          </w:tcPr>
+          <w:p>
+            <w:r/>
+            <w:r>
+              <w:rPr>
+                <w:sz w:val="20"/>
+              </w:rPr>
+              <w:t>{{checklist_items}}</w:t>
+            </w:r>
+          </w:p>
+        </w:tc>
+        <w:tc>
+          <w:tcPr>
+            <w:tcW w:type="dxa" w:w="3969"/>
+          </w:tcPr>
+          <w:p>
+            <w:r/>
+            <w:r>
+              <w:rPr>
+                <w:sz w:val="20"/>
+              </w:rPr>
+              <w:t>Checklist Legal theo loại HĐ</w:t>
+            </w:r>
+          </w:p>
+        </w:tc>
+        <w:tc>
+          <w:tcPr>
+            <w:tcW w:type="dxa" w:w="3402"/>
+          </w:tcPr>
+          <w:p>
+            <w:r/>
+            <w:r>
+              <w:rPr>
+                <w:sz w:val="20"/>
+              </w:rPr>
+              <w:t>Đồng bộ với stage 1</w:t>
+            </w:r>
+          </w:p>
+        </w:tc>
+      </w:tr>
+      <w:tr>
+        <w:tc>
+          <w:tcPr>
+            <w:tcW w:type="dxa" w:w="2268"/>
+          </w:tcPr>
+          <w:p>
+            <w:r/>
+            <w:r>
+              <w:rPr>
+                <w:sz w:val="20"/>
+              </w:rPr>
+              <w:t>{{conversation_history}}</w:t>
+            </w:r>
+          </w:p>
+        </w:tc>
+        <w:tc>
+          <w:tcPr>
+            <w:tcW w:type="dxa" w:w="3969"/>
+          </w:tcPr>
+          <w:p>
+            <w:r/>
+            <w:r>
+              <w:rPr>
+                <w:sz w:val="20"/>
+              </w:rPr>
+              <w:t>Mảng tin nhắn chat (role/content)</w:t>
+            </w:r>
+          </w:p>
+        </w:tc>
+        <w:tc>
+          <w:tcPr>
+            <w:tcW w:type="dxa" w:w="3402"/>
+          </w:tcPr>
+          <w:p>
+            <w:r/>
+            <w:r>
+              <w:rPr>
+                <w:sz w:val="20"/>
+              </w:rPr>
+              <w:t>Serialize rõ ràng từng turn</w:t>
+            </w:r>
+          </w:p>
+        </w:tc>
+      </w:tr>
+      <w:tr>
+        <w:tc>
+          <w:tcPr>
+            <w:tcW w:type="dxa" w:w="2268"/>
+          </w:tcPr>
+          <w:p>
+            <w:r/>
+            <w:r>
+              <w:rPr>
+                <w:sz w:val="20"/>
+              </w:rPr>
+              <w:t>{{current_document_state}}</w:t>
+            </w:r>
+          </w:p>
+        </w:tc>
+        <w:tc>
+          <w:tcPr>
+            <w:tcW w:type="dxa" w:w="3969"/>
+          </w:tcPr>
+          <w:p>
+            <w:r/>
+            <w:r>
+              <w:rPr>
+                <w:sz w:val="20"/>
+              </w:rPr>
+              <w:t>reviewedText / OOXML excerpt</w:t>
+            </w:r>
+          </w:p>
+        </w:tc>
+        <w:tc>
+          <w:tcPr>
+            <w:tcW w:type="dxa" w:w="3402"/>
+          </w:tcPr>
+          <w:p>
+            <w:r/>
+            <w:r>
+              <w:rPr>
+                <w:sz w:val="20"/>
+              </w:rPr>
+              <w:t>Trạng thái sau Accept/Undo gần nhất</w:t>
+            </w:r>
+          </w:p>
+        </w:tc>
+      </w:tr>
+    </w:tbl>
+    <w:p/>
+    <w:p>
+      <w:pPr>
+        <w:pStyle w:val="Heading4"/>
+      </w:pPr>
+      <w:r>
+        <w:t>5.3.6 Stage 3 — AI summary &amp; fairness</w:t>
+      </w:r>
+    </w:p>
+    <w:p>
+      <w:r>
+        <w:rPr>
+          <w:b/>
+          <w:i w:val="0"/>
+          <w:sz w:val="20"/>
+        </w:rPr>
+        <w:t>Mục đích chức năng:</w:t>
+      </w:r>
+    </w:p>
+    <w:p>
+      <w:pPr>
+        <w:pStyle w:val="ListBullet"/>
+      </w:pPr>
+      <w:r>
+        <w:t>Tóm tắt kết quả rà soát bằng ngôn ngữ tự nhiên và hỗ trợ diễn giải Fairness Score (cân bằng điều khoản cho Công ty).</w:t>
+      </w:r>
+    </w:p>
+    <w:p>
+      <w:pPr>
+        <w:pStyle w:val="ListBullet"/>
+      </w:pPr>
+      <w:r>
+        <w:t>Tách biệt với % tin cậy AI (AI Confidence) — hai chỉ số không gộp một số.</w:t>
+      </w:r>
+    </w:p>
+    <w:p>
+      <w:r>
+        <w:rPr>
+          <w:b/>
+          <w:i w:val="0"/>
+          <w:sz w:val="20"/>
+        </w:rPr>
+        <w:t>Logic cấu hình &amp; sử dụng (Dev):</w:t>
+      </w:r>
+    </w:p>
+    <w:p>
+      <w:pPr>
+        <w:pStyle w:val="ListBullet"/>
+      </w:pPr>
+      <w:r>
+        <w:t>Folder: `prompts/ai_summary_fairness/` · `current.json` → `vN.md`.</w:t>
+      </w:r>
+    </w:p>
+    <w:p>
+      <w:pPr>
+        <w:pStyle w:val="ListBullet"/>
+      </w:pPr>
+      <w:r>
+        <w:t>Input `{{findings}}` = output đã có từ Checklist review (và/hoặc cập nhật sau Chat edit) — serialize Red Flag / Warning / Protection / Missing Protection.</w:t>
+      </w:r>
+    </w:p>
+    <w:p>
+      <w:pPr>
+        <w:pStyle w:val="ListBullet"/>
+      </w:pPr>
+      <w:r>
+        <w:t>`{{approval_matrix_context}}` = matrix gắn loại HĐ hoặc global (ngưỡng giá trị ↔ cấp duyệt) — chỉ để cảnh báo / diễn giải, không routing nhiều cấp ở Sprint 1.</w:t>
+      </w:r>
+    </w:p>
+    <w:p>
+      <w:pPr>
+        <w:pStyle w:val="ListBullet"/>
+      </w:pPr>
+      <w:r>
+        <w:t>Gọi khi: mở popup % tin cậy / Fairness, hoặc sau mỗi lần findings đổi. `loadSystemPrompt("ai_summary_fairness")`.</w:t>
+      </w:r>
+    </w:p>
+    <w:p>
+      <w:pPr>
+        <w:pStyle w:val="ListBullet"/>
+      </w:pPr>
+      <w:r>
+        <w:t>Parse JSON `{ aiSummary, fairnessNotes }` → hiển thị trên Contract Insight popup; Fairness Score số học có thể tính heuristic từ findings + dùng fairnessNotes làm giải thích.</w:t>
+      </w:r>
+    </w:p>
+    <w:p>
+      <w:pPr>
+        <w:pStyle w:val="ListBullet"/>
+      </w:pPr>
+      <w:r>
+        <w:t>Demo hiện dùng heuristic trong `contract-insight.ts` — khi nối LLM, ưu tiên aiSummary từ stage này.</w:t>
+      </w:r>
+    </w:p>
+    <w:tbl>
+      <w:tblPr>
+        <w:tblStyle w:val="TableGrid"/>
+        <w:tblW w:type="auto" w:w="0"/>
+        <w:jc w:val="center"/>
+        <w:tblLook w:firstColumn="1" w:firstRow="1" w:lastColumn="0" w:lastRow="0" w:noHBand="0" w:noVBand="1" w:val="04A0"/>
+      </w:tblPr>
+      <w:tblGrid>
+        <w:gridCol w:w="3213"/>
+        <w:gridCol w:w="3213"/>
+        <w:gridCol w:w="3213"/>
+      </w:tblGrid>
+      <w:tr>
+        <w:tc>
+          <w:tcPr>
+            <w:tcW w:type="dxa" w:w="2268"/>
+          </w:tcPr>
+          <w:p>
+            <w:r/>
+            <w:r>
+              <w:rPr>
+                <w:b/>
+                <w:sz w:val="20"/>
+              </w:rPr>
+              <w:t>Placeholder</w:t>
+            </w:r>
+          </w:p>
+        </w:tc>
+        <w:tc>
+          <w:tcPr>
+            <w:tcW w:type="dxa" w:w="3969"/>
+          </w:tcPr>
+          <w:p>
+            <w:r/>
+            <w:r>
+              <w:rPr>
+                <w:b/>
+                <w:sz w:val="20"/>
+              </w:rPr>
+              <w:t>Nguồn dữ liệu runtime</w:t>
+            </w:r>
+          </w:p>
+        </w:tc>
+        <w:tc>
+          <w:tcPr>
+            <w:tcW w:type="dxa" w:w="3402"/>
+          </w:tcPr>
+          <w:p>
+            <w:r/>
+            <w:r>
+              <w:rPr>
+                <w:b/>
+                <w:sz w:val="20"/>
+              </w:rPr>
+              <w:t>Ghi chú</w:t>
+            </w:r>
+          </w:p>
+        </w:tc>
+      </w:tr>
+      <w:tr>
+        <w:tc>
+          <w:tcPr>
+            <w:tcW w:type="dxa" w:w="2268"/>
+          </w:tcPr>
+          <w:p>
+            <w:r/>
+            <w:r>
+              <w:rPr>
+                <w:sz w:val="20"/>
+              </w:rPr>
+              <w:t>{{contract_type}}</w:t>
+            </w:r>
+          </w:p>
+        </w:tc>
+        <w:tc>
+          <w:tcPr>
+            <w:tcW w:type="dxa" w:w="3969"/>
+          </w:tcPr>
+          <w:p>
+            <w:r/>
+            <w:r>
+              <w:rPr>
+                <w:sz w:val="20"/>
+              </w:rPr>
+              <w:t>Loại HĐ</w:t>
+            </w:r>
+          </w:p>
+        </w:tc>
+        <w:tc>
+          <w:tcPr>
+            <w:tcW w:type="dxa" w:w="3402"/>
+          </w:tcPr>
+          <w:p>
+            <w:r/>
+            <w:r>
+              <w:rPr>
+                <w:sz w:val="20"/>
+              </w:rPr>
+              <w:t>Ngữ cảnh tóm tắt</w:t>
+            </w:r>
+          </w:p>
+        </w:tc>
+      </w:tr>
+      <w:tr>
+        <w:tc>
+          <w:tcPr>
+            <w:tcW w:type="dxa" w:w="2268"/>
+          </w:tcPr>
+          <w:p>
+            <w:r/>
+            <w:r>
+              <w:rPr>
+                <w:sz w:val="20"/>
+              </w:rPr>
+              <w:t>{{findings}}</w:t>
+            </w:r>
+          </w:p>
+        </w:tc>
+        <w:tc>
+          <w:tcPr>
+            <w:tcW w:type="dxa" w:w="3969"/>
+          </w:tcPr>
+          <w:p>
+            <w:r/>
+            <w:r>
+              <w:rPr>
+                <w:sz w:val="20"/>
+              </w:rPr>
+              <w:t>Kết quả stage Checklist review (+ cập nhật sau)</w:t>
+            </w:r>
+          </w:p>
+        </w:tc>
+        <w:tc>
+          <w:tcPr>
+            <w:tcW w:type="dxa" w:w="3402"/>
+          </w:tcPr>
+          <w:p>
+            <w:r/>
+            <w:r>
+              <w:rPr>
+                <w:sz w:val="20"/>
+              </w:rPr>
+              <w:t>Không gọi stage này khi chưa có findings</w:t>
+            </w:r>
+          </w:p>
+        </w:tc>
+      </w:tr>
+      <w:tr>
+        <w:tc>
+          <w:tcPr>
+            <w:tcW w:type="dxa" w:w="2268"/>
+          </w:tcPr>
+          <w:p>
+            <w:r/>
+            <w:r>
+              <w:rPr>
+                <w:sz w:val="20"/>
+              </w:rPr>
+              <w:t>{{approval_matrix_context}}</w:t>
+            </w:r>
+          </w:p>
+        </w:tc>
+        <w:tc>
+          <w:tcPr>
+            <w:tcW w:type="dxa" w:w="3969"/>
+          </w:tcPr>
+          <w:p>
+            <w:r/>
+            <w:r>
+              <w:rPr>
+                <w:sz w:val="20"/>
+              </w:rPr>
+              <w:t>Approval Matrix linked / global</w:t>
+            </w:r>
+          </w:p>
+        </w:tc>
+        <w:tc>
+          <w:tcPr>
+            <w:tcW w:type="dxa" w:w="3402"/>
+          </w:tcPr>
+          <w:p>
+            <w:r/>
+            <w:r>
+              <w:rPr>
+                <w:sz w:val="20"/>
+              </w:rPr>
+              <w:t>Chỉ cảnh báo cấp duyệt — không tự route</w:t>
+            </w:r>
+          </w:p>
+        </w:tc>
+      </w:tr>
+    </w:tbl>
+    <w:p/>
+    <w:p>
+      <w:pPr>
+        <w:pStyle w:val="Heading4"/>
+      </w:pPr>
+      <w:r>
+        <w:t>5.3.7 Luồng gọi 3 stage trong pipeline (Dev)</w:t>
+      </w:r>
+    </w:p>
+    <w:p>
+      <w:pPr>
+        <w:pStyle w:val="ListBullet"/>
+      </w:pPr>
+      <w:r>
+        <w:t>1) HĐ queued → (rule-based keywords tuỳ chọn) → LLM Checklist review → lưu findings + proposals A/B → status reviewed.</w:t>
+      </w:r>
+    </w:p>
+    <w:p>
+      <w:pPr>
+        <w:pStyle w:val="ListBullet"/>
+      </w:pPr>
+      <w:r>
+        <w:t>2) User Chat → LLM Chat edit → cập nhật document_state + có thể refresh findings nhẹ → re-validate allow-list.</w:t>
+      </w:r>
+    </w:p>
+    <w:p>
+      <w:pPr>
+        <w:pStyle w:val="ListBullet"/>
+      </w:pPr>
+      <w:r>
+        <w:t>3) Mở insight / sau bước 1–2 → LLM AI summary &amp; fairness → cập nhật aiSummary + fairnessNotes trên UI.</w:t>
+      </w:r>
+    </w:p>
+    <w:p>
+      <w:pPr>
+        <w:pStyle w:val="ListBullet"/>
+      </w:pPr>
+      <w:r>
+        <w:t>Mọi lần gọi LLM: prepend injection_guard; không tin chỉ dẫn trong nội dung HĐ / chat (anti prompt-injection).</w:t>
+      </w:r>
+    </w:p>
+    <w:p>
+      <w:r>
+        <w:rPr>
+          <w:i/>
+          <w:color w:val="B05000"/>
+          <w:sz w:val="20"/>
+        </w:rPr>
+        <w:t>Ghi chú: Thứ tự bắt buộc về dữ liệu: Checklist review trước khi có findings đầy đủ; Chat edit và Summary đều phụ thuộc checklist + (Summary phụ thuộc findings). Không gọi Summary như first-pass thay Checklist review.</w:t>
+      </w:r>
+    </w:p>
     <w:p>
       <w:pPr>
         <w:pStyle w:val="Heading2"/>
@@ -17159,7 +18772,7 @@
               <w:drawing>
                 <wp:inline xmlns:a="http://schemas.openxmlformats.org/drawingml/2006/main" xmlns:pic="http://schemas.openxmlformats.org/drawingml/2006/picture">
                   <wp:extent cx="5940000" cy="3564000"/>
-                  <wp:docPr id="26" name="Picture 26"/>
+                  <wp:docPr id="27" name="Picture 27"/>
                   <wp:cNvGraphicFramePr>
                     <a:graphicFrameLocks noChangeAspect="1"/>
                   </wp:cNvGraphicFramePr>
@@ -17171,7 +18784,7 @@
                           <pic:cNvPicPr/>
                         </pic:nvPicPr>
                         <pic:blipFill>
-                          <a:blip r:embed="rId34"/>
+                          <a:blip r:embed="rId35"/>
                           <a:stretch>
                             <a:fillRect/>
                           </a:stretch>
@@ -17248,7 +18861,7 @@
               <w:drawing>
                 <wp:inline xmlns:a="http://schemas.openxmlformats.org/drawingml/2006/main" xmlns:pic="http://schemas.openxmlformats.org/drawingml/2006/picture">
                   <wp:extent cx="5940000" cy="3564000"/>
-                  <wp:docPr id="27" name="Picture 27"/>
+                  <wp:docPr id="28" name="Picture 28"/>
                   <wp:cNvGraphicFramePr>
                     <a:graphicFrameLocks noChangeAspect="1"/>
                   </wp:cNvGraphicFramePr>
@@ -17260,7 +18873,7 @@
                           <pic:cNvPicPr/>
                         </pic:nvPicPr>
                         <pic:blipFill>
-                          <a:blip r:embed="rId35"/>
+                          <a:blip r:embed="rId36"/>
                           <a:stretch>
                             <a:fillRect/>
                           </a:stretch>
@@ -18130,7 +19743,7 @@
               <w:drawing>
                 <wp:inline xmlns:a="http://schemas.openxmlformats.org/drawingml/2006/main" xmlns:pic="http://schemas.openxmlformats.org/drawingml/2006/picture">
                   <wp:extent cx="5940000" cy="3408281"/>
-                  <wp:docPr id="28" name="Picture 28"/>
+                  <wp:docPr id="29" name="Picture 29"/>
                   <wp:cNvGraphicFramePr>
                     <a:graphicFrameLocks noChangeAspect="1"/>
                   </wp:cNvGraphicFramePr>
@@ -18142,7 +19755,7 @@
                           <pic:cNvPicPr/>
                         </pic:nvPicPr>
                         <pic:blipFill>
-                          <a:blip r:embed="rId36"/>
+                          <a:blip r:embed="rId37"/>
                           <a:stretch>
                             <a:fillRect/>
                           </a:stretch>

</xml_diff>